<commit_message>
compiler design and construction
</commit_message>
<xml_diff>
--- a/front page.docx
+++ b/front page.docx
@@ -251,7 +251,7 @@
           <w:sz w:val="32"/>
           <w:szCs w:val="32"/>
         </w:rPr>
-        <w:t>Software Engineering</w:t>
+        <w:t>Compiler design and Construction</w:t>
       </w:r>
       <w:r>
         <w:rPr>
@@ -495,40 +495,7 @@
           <w:szCs w:val="32"/>
           <w:lang w:val="en-US" w:eastAsia="zh-CN" w:bidi="ar"/>
         </w:rPr>
-        <w:t>s</w:t>
-      </w:r>
-      <w:r>
-        <w:rPr>
-          <w:rFonts w:ascii="Times New Roman" w:eastAsia="SimSun" w:hAnsi="Times New Roman"/>
-          <w:b/>
-          <w:bCs/>
-          <w:sz w:val="32"/>
-          <w:szCs w:val="32"/>
-          <w:lang w:val="en-US" w:eastAsia="zh-CN" w:bidi="ar"/>
-        </w:rPr>
-        <w:t>.</w:t>
-      </w:r>
-      <w:r>
-        <w:rPr>
-          <w:rFonts w:ascii="Times New Roman" w:eastAsia="SimSun" w:hAnsi="Times New Roman"/>
-          <w:b/>
-          <w:bCs/>
-          <w:sz w:val="32"/>
-          <w:szCs w:val="32"/>
-          <w:lang w:val="en-US" w:eastAsia="zh-CN" w:bidi="ar"/>
-        </w:rPr>
-        <w:t xml:space="preserve"> Nilam Thapa</w:t>
-      </w:r>
-      <w:r>
-        <w:rPr>
-          <w:rFonts w:ascii="Times New Roman" w:eastAsia="SimSun" w:hAnsi="Times New Roman"/>
-          <w:b/>
-          <w:bCs/>
-          <w:sz w:val="32"/>
-          <w:szCs w:val="32"/>
-          <w:lang w:val="en-US" w:eastAsia="zh-CN" w:bidi="ar"/>
-        </w:rPr>
-        <w:t xml:space="preserve"> </w:t>
+        <w:t>. Tara Bahadur Thapa</w:t>
       </w:r>
     </w:p>
     <w:p>

</xml_diff>